<commit_message>
add new things about laravel like Yajra datatables, migration, seeder etc
</commit_message>
<xml_diff>
--- a/Web Doc.docx
+++ b/Web Doc.docx
@@ -4642,6 +4642,8 @@
         </w:rPr>
         <w:t xml:space="preserve"> Controller pass the fetch data to view.</w:t>
       </w:r>
+      <w:bookmarkStart w:id="0" w:name="_GoBack"/>
+      <w:bookmarkEnd w:id="0"/>
     </w:p>
     <w:p>
       <w:pPr>
@@ -4701,7 +4703,25 @@
           <w:sz w:val="24"/>
           <w:szCs w:val="24"/>
         </w:rPr>
-        <w:t xml:space="preserve">It is dependency manager(Like we import font awsom or bootstrap library, we are depending on these libraries) software for php </w:t>
+        <w:t xml:space="preserve">It is dependency manager(Like we import font </w:t>
+      </w:r>
+      <w:proofErr w:type="spellStart"/>
+      <w:r>
+        <w:rPr>
+          <w:rFonts w:cstheme="minorHAnsi"/>
+          <w:sz w:val="24"/>
+          <w:szCs w:val="24"/>
+        </w:rPr>
+        <w:t>awsom</w:t>
+      </w:r>
+      <w:proofErr w:type="spellEnd"/>
+      <w:r>
+        <w:rPr>
+          <w:rFonts w:cstheme="minorHAnsi"/>
+          <w:sz w:val="24"/>
+          <w:szCs w:val="24"/>
+        </w:rPr>
+        <w:t xml:space="preserve"> or bootstrap library, we are depending on these libraries) software for php </w:t>
       </w:r>
       <w:r>
         <w:rPr>
@@ -4793,7 +4813,25 @@
           <w:sz w:val="24"/>
           <w:szCs w:val="24"/>
         </w:rPr>
-        <w:t xml:space="preserve"> Blade View files can be create out of resources folder just go config file for path.</w:t>
+        <w:t xml:space="preserve"> Blade View files can be </w:t>
+      </w:r>
+      <w:proofErr w:type="gramStart"/>
+      <w:r>
+        <w:rPr>
+          <w:rFonts w:cstheme="minorHAnsi"/>
+          <w:sz w:val="24"/>
+          <w:szCs w:val="24"/>
+        </w:rPr>
+        <w:t>create</w:t>
+      </w:r>
+      <w:proofErr w:type="gramEnd"/>
+      <w:r>
+        <w:rPr>
+          <w:rFonts w:cstheme="minorHAnsi"/>
+          <w:sz w:val="24"/>
+          <w:szCs w:val="24"/>
+        </w:rPr>
+        <w:t xml:space="preserve"> out of resources folder just go config file for path.</w:t>
       </w:r>
     </w:p>
     <w:p>
@@ -4821,7 +4859,25 @@
           <w:sz w:val="24"/>
           <w:szCs w:val="24"/>
         </w:rPr>
-        <w:t xml:space="preserve"> route::get(‘home’), function(){return view(‘home’)}); or route::view(‘home’,’home’);</w:t>
+        <w:t xml:space="preserve"> route::get(‘home’), function(){return view(‘home’)}); or route::view(‘</w:t>
+      </w:r>
+      <w:proofErr w:type="spellStart"/>
+      <w:r>
+        <w:rPr>
+          <w:rFonts w:cstheme="minorHAnsi"/>
+          <w:sz w:val="24"/>
+          <w:szCs w:val="24"/>
+        </w:rPr>
+        <w:t>home’,’home</w:t>
+      </w:r>
+      <w:proofErr w:type="spellEnd"/>
+      <w:r>
+        <w:rPr>
+          <w:rFonts w:cstheme="minorHAnsi"/>
+          <w:sz w:val="24"/>
+          <w:szCs w:val="24"/>
+        </w:rPr>
+        <w:t>’);</w:t>
       </w:r>
     </w:p>
     <w:p>
@@ -4849,7 +4905,43 @@
           <w:sz w:val="24"/>
           <w:szCs w:val="24"/>
         </w:rPr>
-        <w:t xml:space="preserve"> php artisan make:controller controller_name. Create function in controller that will perform action like return view or get data from database and much more.</w:t>
+        <w:t xml:space="preserve"> php artisan </w:t>
+      </w:r>
+      <w:proofErr w:type="spellStart"/>
+      <w:r>
+        <w:rPr>
+          <w:rFonts w:cstheme="minorHAnsi"/>
+          <w:sz w:val="24"/>
+          <w:szCs w:val="24"/>
+        </w:rPr>
+        <w:t>make:controller</w:t>
+      </w:r>
+      <w:proofErr w:type="spellEnd"/>
+      <w:r>
+        <w:rPr>
+          <w:rFonts w:cstheme="minorHAnsi"/>
+          <w:sz w:val="24"/>
+          <w:szCs w:val="24"/>
+        </w:rPr>
+        <w:t xml:space="preserve"> </w:t>
+      </w:r>
+      <w:proofErr w:type="spellStart"/>
+      <w:r>
+        <w:rPr>
+          <w:rFonts w:cstheme="minorHAnsi"/>
+          <w:sz w:val="24"/>
+          <w:szCs w:val="24"/>
+        </w:rPr>
+        <w:t>controller_name</w:t>
+      </w:r>
+      <w:proofErr w:type="spellEnd"/>
+      <w:r>
+        <w:rPr>
+          <w:rFonts w:cstheme="minorHAnsi"/>
+          <w:sz w:val="24"/>
+          <w:szCs w:val="24"/>
+        </w:rPr>
+        <w:t>. Create function in controller that will perform action like return view or get data from database and much more.</w:t>
       </w:r>
     </w:p>
     <w:p>
@@ -4877,7 +4969,25 @@
           <w:sz w:val="24"/>
           <w:szCs w:val="24"/>
         </w:rPr>
-        <w:t xml:space="preserve"> First of all import controller in web.php like </w:t>
+        <w:t xml:space="preserve"> First of all import controller in </w:t>
+      </w:r>
+      <w:proofErr w:type="spellStart"/>
+      <w:r>
+        <w:rPr>
+          <w:rFonts w:cstheme="minorHAnsi"/>
+          <w:sz w:val="24"/>
+          <w:szCs w:val="24"/>
+        </w:rPr>
+        <w:t>web.php</w:t>
+      </w:r>
+      <w:proofErr w:type="spellEnd"/>
+      <w:r>
+        <w:rPr>
+          <w:rFonts w:cstheme="minorHAnsi"/>
+          <w:sz w:val="24"/>
+          <w:szCs w:val="24"/>
+        </w:rPr>
+        <w:t xml:space="preserve"> like </w:t>
       </w:r>
       <w:r>
         <w:rPr>
@@ -4895,7 +5005,29 @@
           <w:sz w:val="20"/>
           <w:szCs w:val="20"/>
         </w:rPr>
-        <w:t>App\Http\Controllers\testcontroller;</w:t>
+        <w:t>App\Http\Controllers\</w:t>
+      </w:r>
+      <w:proofErr w:type="spellStart"/>
+      <w:r>
+        <w:rPr>
+          <w:rFonts w:cstheme="minorHAnsi"/>
+          <w:b/>
+          <w:bCs/>
+          <w:sz w:val="20"/>
+          <w:szCs w:val="20"/>
+        </w:rPr>
+        <w:t>testcontroller</w:t>
+      </w:r>
+      <w:proofErr w:type="spellEnd"/>
+      <w:r>
+        <w:rPr>
+          <w:rFonts w:cstheme="minorHAnsi"/>
+          <w:b/>
+          <w:bCs/>
+          <w:sz w:val="20"/>
+          <w:szCs w:val="20"/>
+        </w:rPr>
+        <w:t>;</w:t>
       </w:r>
     </w:p>
     <w:p>
@@ -4921,7 +5053,43 @@
           <w:b/>
           <w:bCs/>
         </w:rPr>
-        <w:t>Route::get(‘home’,[testcontroller::class,’function_name’]);</w:t>
+        <w:t>Route::get(‘home’,[</w:t>
+      </w:r>
+      <w:proofErr w:type="spellStart"/>
+      <w:r>
+        <w:rPr>
+          <w:rFonts w:cstheme="minorHAnsi"/>
+          <w:b/>
+          <w:bCs/>
+        </w:rPr>
+        <w:t>testcontroller</w:t>
+      </w:r>
+      <w:proofErr w:type="spellEnd"/>
+      <w:r>
+        <w:rPr>
+          <w:rFonts w:cstheme="minorHAnsi"/>
+          <w:b/>
+          <w:bCs/>
+        </w:rPr>
+        <w:t>::class,’</w:t>
+      </w:r>
+      <w:proofErr w:type="spellStart"/>
+      <w:r>
+        <w:rPr>
+          <w:rFonts w:cstheme="minorHAnsi"/>
+          <w:b/>
+          <w:bCs/>
+        </w:rPr>
+        <w:t>function_name</w:t>
+      </w:r>
+      <w:proofErr w:type="spellEnd"/>
+      <w:r>
+        <w:rPr>
+          <w:rFonts w:cstheme="minorHAnsi"/>
+          <w:b/>
+          <w:bCs/>
+        </w:rPr>
+        <w:t>’]);</w:t>
       </w:r>
     </w:p>
     <w:p>
@@ -4949,7 +5117,25 @@
           <w:sz w:val="24"/>
           <w:szCs w:val="24"/>
         </w:rPr>
-        <w:t>php artisan make:component header.  Once it create it can be used multiple time. It create two files, one html file in resources and other php file in app folder. Where we want to call it we just type &lt;x-component name /&gt;</w:t>
+        <w:t xml:space="preserve">php artisan </w:t>
+      </w:r>
+      <w:proofErr w:type="spellStart"/>
+      <w:r>
+        <w:rPr>
+          <w:rFonts w:cstheme="minorHAnsi"/>
+          <w:sz w:val="24"/>
+          <w:szCs w:val="24"/>
+        </w:rPr>
+        <w:t>make:component</w:t>
+      </w:r>
+      <w:proofErr w:type="spellEnd"/>
+      <w:r>
+        <w:rPr>
+          <w:rFonts w:cstheme="minorHAnsi"/>
+          <w:sz w:val="24"/>
+          <w:szCs w:val="24"/>
+        </w:rPr>
+        <w:t xml:space="preserve"> header.  Once it create it can be used multiple time. It create two files, one html file in resources and other php file in app folder. Where we want to call it we just type &lt;x-component name /&gt;</w:t>
       </w:r>
     </w:p>
     <w:p>
@@ -5005,7 +5191,25 @@
           <w:sz w:val="24"/>
           <w:szCs w:val="24"/>
         </w:rPr>
-        <w:t>@foreach($data as $result) &lt;div&gt;{{$result}}&lt;/div&gt; @endforeach.</w:t>
+        <w:t>@foreach($data as $result) &lt;div&gt;{{$result}}&lt;/div&gt; @</w:t>
+      </w:r>
+      <w:proofErr w:type="spellStart"/>
+      <w:r>
+        <w:rPr>
+          <w:rFonts w:cstheme="minorHAnsi"/>
+          <w:sz w:val="24"/>
+          <w:szCs w:val="24"/>
+        </w:rPr>
+        <w:t>endforeach</w:t>
+      </w:r>
+      <w:proofErr w:type="spellEnd"/>
+      <w:r>
+        <w:rPr>
+          <w:rFonts w:cstheme="minorHAnsi"/>
+          <w:sz w:val="24"/>
+          <w:szCs w:val="24"/>
+        </w:rPr>
+        <w:t>.</w:t>
       </w:r>
     </w:p>
     <w:p>
@@ -5089,7 +5293,25 @@
           <w:sz w:val="24"/>
           <w:szCs w:val="24"/>
         </w:rPr>
-        <w:t>The layer, used to filter http requests. Php artisan make:middleware testing</w:t>
+        <w:t xml:space="preserve">The layer, used to filter http requests. Php artisan </w:t>
+      </w:r>
+      <w:proofErr w:type="spellStart"/>
+      <w:r>
+        <w:rPr>
+          <w:rFonts w:cstheme="minorHAnsi"/>
+          <w:sz w:val="24"/>
+          <w:szCs w:val="24"/>
+        </w:rPr>
+        <w:t>make:middleware</w:t>
+      </w:r>
+      <w:proofErr w:type="spellEnd"/>
+      <w:r>
+        <w:rPr>
+          <w:rFonts w:cstheme="minorHAnsi"/>
+          <w:sz w:val="24"/>
+          <w:szCs w:val="24"/>
+        </w:rPr>
+        <w:t xml:space="preserve"> testing</w:t>
       </w:r>
     </w:p>
     <w:p>
@@ -5214,7 +5436,25 @@
           <w:sz w:val="24"/>
           <w:szCs w:val="24"/>
         </w:rPr>
-        <w:t>route::view('home', 'welcome')-&gt;middleware('noaccess');</w:t>
+        <w:t>route::view('home', 'welcome')-&gt;middleware('</w:t>
+      </w:r>
+      <w:proofErr w:type="spellStart"/>
+      <w:r>
+        <w:rPr>
+          <w:rFonts w:cstheme="minorHAnsi"/>
+          <w:sz w:val="24"/>
+          <w:szCs w:val="24"/>
+        </w:rPr>
+        <w:t>noaccess</w:t>
+      </w:r>
+      <w:proofErr w:type="spellEnd"/>
+      <w:r>
+        <w:rPr>
+          <w:rFonts w:cstheme="minorHAnsi"/>
+          <w:sz w:val="24"/>
+          <w:szCs w:val="24"/>
+        </w:rPr>
+        <w:t>');</w:t>
       </w:r>
       <w:r>
         <w:rPr>
@@ -5250,7 +5490,25 @@
           <w:sz w:val="24"/>
           <w:szCs w:val="24"/>
         </w:rPr>
-        <w:t xml:space="preserve"> php artisan make:model model_name</w:t>
+        <w:t xml:space="preserve"> php artisan </w:t>
+      </w:r>
+      <w:proofErr w:type="spellStart"/>
+      <w:r>
+        <w:rPr>
+          <w:rFonts w:cstheme="minorHAnsi"/>
+          <w:sz w:val="24"/>
+          <w:szCs w:val="24"/>
+        </w:rPr>
+        <w:t>make:model</w:t>
+      </w:r>
+      <w:proofErr w:type="spellEnd"/>
+      <w:r>
+        <w:rPr>
+          <w:rFonts w:cstheme="minorHAnsi"/>
+          <w:sz w:val="24"/>
+          <w:szCs w:val="24"/>
+        </w:rPr>
+        <w:t xml:space="preserve"> model_name</w:t>
       </w:r>
     </w:p>
     <w:p>
@@ -5410,7 +5668,25 @@
           <w:sz w:val="24"/>
           <w:szCs w:val="24"/>
         </w:rPr>
-        <w:t xml:space="preserve"> $data=Http::get(‘url’); and </w:t>
+        <w:t xml:space="preserve"> $data=Http::get(‘</w:t>
+      </w:r>
+      <w:proofErr w:type="spellStart"/>
+      <w:r>
+        <w:rPr>
+          <w:rFonts w:cstheme="minorHAnsi"/>
+          <w:sz w:val="24"/>
+          <w:szCs w:val="24"/>
+        </w:rPr>
+        <w:t>url</w:t>
+      </w:r>
+      <w:proofErr w:type="spellEnd"/>
+      <w:r>
+        <w:rPr>
+          <w:rFonts w:cstheme="minorHAnsi"/>
+          <w:sz w:val="24"/>
+          <w:szCs w:val="24"/>
+        </w:rPr>
+        <w:t xml:space="preserve">’); and </w:t>
       </w:r>
       <w:r>
         <w:rPr>
@@ -5426,7 +5702,25 @@
           <w:sz w:val="24"/>
           <w:szCs w:val="24"/>
         </w:rPr>
-        <w:t xml:space="preserve"> then return view( ‘view name’ ,[‘api_data’=&gt;$data[‘data’]]);</w:t>
+        <w:t xml:space="preserve"> then return view( ‘view name’ ,[‘</w:t>
+      </w:r>
+      <w:proofErr w:type="spellStart"/>
+      <w:r>
+        <w:rPr>
+          <w:rFonts w:cstheme="minorHAnsi"/>
+          <w:sz w:val="24"/>
+          <w:szCs w:val="24"/>
+        </w:rPr>
+        <w:t>api_data</w:t>
+      </w:r>
+      <w:proofErr w:type="spellEnd"/>
+      <w:r>
+        <w:rPr>
+          <w:rFonts w:cstheme="minorHAnsi"/>
+          <w:sz w:val="24"/>
+          <w:szCs w:val="24"/>
+        </w:rPr>
+        <w:t>’=&gt;$data[‘data’]]);</w:t>
       </w:r>
     </w:p>
     <w:p>
@@ -5454,7 +5748,25 @@
           <w:sz w:val="24"/>
           <w:szCs w:val="24"/>
         </w:rPr>
-        <w:t xml:space="preserve"> It store data until page reload. $request-&gt;session()-&gt;flash(‘key’,$data);</w:t>
+        <w:t xml:space="preserve"> It store data until page reload. $request-&gt;session()-&gt;flash(‘</w:t>
+      </w:r>
+      <w:proofErr w:type="spellStart"/>
+      <w:r>
+        <w:rPr>
+          <w:rFonts w:cstheme="minorHAnsi"/>
+          <w:sz w:val="24"/>
+          <w:szCs w:val="24"/>
+        </w:rPr>
+        <w:t>key’,$data</w:t>
+      </w:r>
+      <w:proofErr w:type="spellEnd"/>
+      <w:r>
+        <w:rPr>
+          <w:rFonts w:cstheme="minorHAnsi"/>
+          <w:sz w:val="24"/>
+          <w:szCs w:val="24"/>
+        </w:rPr>
+        <w:t>);</w:t>
       </w:r>
     </w:p>
     <w:p>
@@ -5510,7 +5822,25 @@
           <w:sz w:val="24"/>
           <w:szCs w:val="24"/>
         </w:rPr>
-        <w:t xml:space="preserve"> session()-&gt;pull(‘key’,null);</w:t>
+        <w:t xml:space="preserve"> session()-&gt;pull(‘</w:t>
+      </w:r>
+      <w:proofErr w:type="spellStart"/>
+      <w:r>
+        <w:rPr>
+          <w:rFonts w:cstheme="minorHAnsi"/>
+          <w:sz w:val="24"/>
+          <w:szCs w:val="24"/>
+        </w:rPr>
+        <w:t>key’,null</w:t>
+      </w:r>
+      <w:proofErr w:type="spellEnd"/>
+      <w:r>
+        <w:rPr>
+          <w:rFonts w:cstheme="minorHAnsi"/>
+          <w:sz w:val="24"/>
+          <w:szCs w:val="24"/>
+        </w:rPr>
+        <w:t>);</w:t>
       </w:r>
     </w:p>
     <w:p>
@@ -5550,8 +5880,20 @@
           <w:szCs w:val="21"/>
           <w:shd w:val="clear" w:color="auto" w:fill="FFFFFF"/>
         </w:rPr>
-        <w:t>php artisan lang:publish</w:t>
-      </w:r>
+        <w:t xml:space="preserve">php artisan </w:t>
+      </w:r>
+      <w:proofErr w:type="spellStart"/>
+      <w:r>
+        <w:rPr>
+          <w:rFonts w:ascii="Arial" w:hAnsi="Arial" w:cs="Arial"/>
+          <w:color w:val="0F0F0F"/>
+          <w:sz w:val="21"/>
+          <w:szCs w:val="21"/>
+          <w:shd w:val="clear" w:color="auto" w:fill="FFFFFF"/>
+        </w:rPr>
+        <w:t>lang:publish</w:t>
+      </w:r>
+      <w:proofErr w:type="spellEnd"/>
     </w:p>
     <w:p>
       <w:pPr>
@@ -5612,6 +5954,7 @@
         </w:rPr>
         <w:t>‘</w:t>
       </w:r>
+      <w:proofErr w:type="spellStart"/>
       <w:r>
         <w:rPr>
           <w:rFonts w:cstheme="minorHAnsi"/>
@@ -5620,6 +5963,7 @@
         </w:rPr>
         <w:t>table_name</w:t>
       </w:r>
+      <w:proofErr w:type="spellEnd"/>
       <w:r>
         <w:rPr>
           <w:rFonts w:cstheme="minorHAnsi"/>
@@ -5656,6 +6000,1595 @@
         </w:rPr>
         <w:t xml:space="preserve"> $data=Student::paginate(5); return view(‘view name’,[‘records’=&gt;$data]); In last &lt;div&gt; {{$data -&gt; links()}}&lt;/div&gt;</w:t>
       </w:r>
+    </w:p>
+    <w:p>
+      <w:pPr>
+        <w:spacing w:after="0" w:line="240" w:lineRule="auto"/>
+        <w:rPr>
+          <w:rFonts w:cstheme="minorHAnsi"/>
+          <w:sz w:val="24"/>
+          <w:szCs w:val="24"/>
+        </w:rPr>
+      </w:pPr>
+      <w:r>
+        <w:rPr>
+          <w:rFonts w:cstheme="minorHAnsi"/>
+          <w:b/>
+          <w:bCs/>
+          <w:sz w:val="24"/>
+          <w:szCs w:val="24"/>
+        </w:rPr>
+        <w:t>Compact():</w:t>
+      </w:r>
+      <w:r>
+        <w:rPr>
+          <w:rFonts w:cstheme="minorHAnsi"/>
+          <w:sz w:val="24"/>
+          <w:szCs w:val="24"/>
+        </w:rPr>
+        <w:t xml:space="preserve"> Compact method is used when we return a view and want to pass data with that view. Like </w:t>
+      </w:r>
+      <w:r>
+        <w:rPr>
+          <w:rFonts w:cstheme="minorHAnsi"/>
+          <w:b/>
+          <w:bCs/>
+          <w:sz w:val="20"/>
+          <w:szCs w:val="20"/>
+        </w:rPr>
+        <w:t>return view(‘</w:t>
+      </w:r>
+      <w:proofErr w:type="spellStart"/>
+      <w:r>
+        <w:rPr>
+          <w:rFonts w:cstheme="minorHAnsi"/>
+          <w:b/>
+          <w:bCs/>
+          <w:sz w:val="20"/>
+          <w:szCs w:val="20"/>
+        </w:rPr>
+        <w:t>home’,compact</w:t>
+      </w:r>
+      <w:proofErr w:type="spellEnd"/>
+      <w:r>
+        <w:rPr>
+          <w:rFonts w:cstheme="minorHAnsi"/>
+          <w:b/>
+          <w:bCs/>
+          <w:sz w:val="20"/>
+          <w:szCs w:val="20"/>
+        </w:rPr>
+        <w:t xml:space="preserve"> (‘variable name</w:t>
+      </w:r>
+      <w:r>
+        <w:rPr>
+          <w:rFonts w:cstheme="minorHAnsi"/>
+          <w:b/>
+          <w:bCs/>
+          <w:sz w:val="20"/>
+          <w:szCs w:val="20"/>
+        </w:rPr>
+        <w:t xml:space="preserve"> Without $ sign</w:t>
+      </w:r>
+      <w:r>
+        <w:rPr>
+          <w:rFonts w:cstheme="minorHAnsi"/>
+          <w:b/>
+          <w:bCs/>
+          <w:sz w:val="20"/>
+          <w:szCs w:val="20"/>
+        </w:rPr>
+        <w:t>’);</w:t>
+      </w:r>
+      <w:r>
+        <w:rPr>
+          <w:rFonts w:cstheme="minorHAnsi"/>
+          <w:sz w:val="20"/>
+          <w:szCs w:val="20"/>
+        </w:rPr>
+        <w:t xml:space="preserve"> </w:t>
+      </w:r>
+      <w:r>
+        <w:rPr>
+          <w:rFonts w:cstheme="minorHAnsi"/>
+          <w:sz w:val="24"/>
+          <w:szCs w:val="24"/>
+        </w:rPr>
+        <w:t>If we want to pass multiple variables, just pass their name in compact method. If you want to pass a variable that has an array data, then it must be associative array to show specific data of array on view otherwise foreach loop will display all data of array.</w:t>
+      </w:r>
+    </w:p>
+    <w:p>
+      <w:pPr>
+        <w:spacing w:after="0" w:line="240" w:lineRule="auto"/>
+        <w:rPr>
+          <w:rFonts w:cstheme="minorHAnsi"/>
+          <w:sz w:val="24"/>
+          <w:szCs w:val="24"/>
+        </w:rPr>
+      </w:pPr>
+      <w:r>
+        <w:rPr>
+          <w:rFonts w:cstheme="minorHAnsi"/>
+          <w:b/>
+          <w:bCs/>
+          <w:sz w:val="24"/>
+          <w:szCs w:val="24"/>
+        </w:rPr>
+        <w:t>Why Compact:</w:t>
+      </w:r>
+      <w:r>
+        <w:rPr>
+          <w:rFonts w:cstheme="minorHAnsi"/>
+          <w:sz w:val="24"/>
+          <w:szCs w:val="24"/>
+        </w:rPr>
+        <w:t xml:space="preserve"> When we want to pass variable with same name that we declared to store value</w:t>
+      </w:r>
+    </w:p>
+    <w:p>
+      <w:pPr>
+        <w:spacing w:after="0" w:line="240" w:lineRule="auto"/>
+        <w:rPr>
+          <w:rFonts w:cstheme="minorHAnsi"/>
+          <w:sz w:val="24"/>
+          <w:szCs w:val="24"/>
+        </w:rPr>
+      </w:pPr>
+      <w:r>
+        <w:rPr>
+          <w:rFonts w:cstheme="minorHAnsi"/>
+          <w:b/>
+          <w:bCs/>
+          <w:sz w:val="24"/>
+          <w:szCs w:val="24"/>
+        </w:rPr>
+        <w:t xml:space="preserve">With(): </w:t>
+      </w:r>
+      <w:r>
+        <w:rPr>
+          <w:rFonts w:cstheme="minorHAnsi"/>
+          <w:sz w:val="24"/>
+          <w:szCs w:val="24"/>
+        </w:rPr>
+        <w:t xml:space="preserve">With method </w:t>
+      </w:r>
+      <w:r>
+        <w:rPr>
+          <w:rFonts w:cstheme="minorHAnsi"/>
+          <w:sz w:val="24"/>
+          <w:szCs w:val="24"/>
+        </w:rPr>
+        <w:t xml:space="preserve">is used when we return a view and want to pass data with that view. Like </w:t>
+      </w:r>
+      <w:r>
+        <w:rPr>
+          <w:rFonts w:cstheme="minorHAnsi"/>
+          <w:b/>
+          <w:bCs/>
+          <w:sz w:val="20"/>
+          <w:szCs w:val="20"/>
+        </w:rPr>
+        <w:t>return view(‘home’</w:t>
+      </w:r>
+      <w:r>
+        <w:rPr>
+          <w:rFonts w:cstheme="minorHAnsi"/>
+          <w:b/>
+          <w:bCs/>
+          <w:sz w:val="20"/>
+          <w:szCs w:val="20"/>
+        </w:rPr>
+        <w:t>)-&gt;with</w:t>
+      </w:r>
+      <w:r>
+        <w:rPr>
+          <w:rFonts w:cstheme="minorHAnsi"/>
+          <w:b/>
+          <w:bCs/>
+          <w:sz w:val="20"/>
+          <w:szCs w:val="20"/>
+        </w:rPr>
+        <w:t>(‘</w:t>
+      </w:r>
+      <w:r>
+        <w:rPr>
+          <w:rFonts w:cstheme="minorHAnsi"/>
+          <w:b/>
+          <w:bCs/>
+          <w:sz w:val="20"/>
+          <w:szCs w:val="20"/>
+        </w:rPr>
+        <w:t xml:space="preserve">any </w:t>
+      </w:r>
+      <w:r>
+        <w:rPr>
+          <w:rFonts w:cstheme="minorHAnsi"/>
+          <w:b/>
+          <w:bCs/>
+          <w:sz w:val="20"/>
+          <w:szCs w:val="20"/>
+        </w:rPr>
+        <w:t>name</w:t>
+      </w:r>
+      <w:r>
+        <w:rPr>
+          <w:rFonts w:cstheme="minorHAnsi"/>
+          <w:b/>
+          <w:bCs/>
+          <w:sz w:val="20"/>
+          <w:szCs w:val="20"/>
+        </w:rPr>
+        <w:t>’,</w:t>
+      </w:r>
+      <w:r>
+        <w:rPr>
+          <w:rFonts w:cstheme="minorHAnsi"/>
+          <w:b/>
+          <w:bCs/>
+          <w:sz w:val="20"/>
+          <w:szCs w:val="20"/>
+        </w:rPr>
+        <w:t xml:space="preserve"> </w:t>
+      </w:r>
+      <w:r>
+        <w:rPr>
+          <w:rFonts w:cstheme="minorHAnsi"/>
+          <w:b/>
+          <w:bCs/>
+          <w:sz w:val="20"/>
+          <w:szCs w:val="20"/>
+        </w:rPr>
+        <w:t>variable name</w:t>
+      </w:r>
+      <w:r>
+        <w:rPr>
+          <w:rFonts w:cstheme="minorHAnsi"/>
+          <w:b/>
+          <w:bCs/>
+          <w:sz w:val="20"/>
+          <w:szCs w:val="20"/>
+        </w:rPr>
+        <w:t>);</w:t>
+      </w:r>
+      <w:r>
+        <w:rPr>
+          <w:rFonts w:cstheme="minorHAnsi"/>
+          <w:sz w:val="20"/>
+          <w:szCs w:val="20"/>
+        </w:rPr>
+        <w:t xml:space="preserve"> </w:t>
+      </w:r>
+      <w:r>
+        <w:rPr>
+          <w:rFonts w:cstheme="minorHAnsi"/>
+          <w:sz w:val="24"/>
+          <w:szCs w:val="24"/>
+        </w:rPr>
+        <w:t xml:space="preserve">If we want to pass multiple variables, </w:t>
+      </w:r>
+      <w:r>
+        <w:rPr>
+          <w:rFonts w:cstheme="minorHAnsi"/>
+          <w:sz w:val="24"/>
+          <w:szCs w:val="24"/>
+        </w:rPr>
+        <w:t>use multiple with</w:t>
+      </w:r>
+      <w:r>
+        <w:rPr>
+          <w:rFonts w:cstheme="minorHAnsi"/>
+          <w:sz w:val="24"/>
+          <w:szCs w:val="24"/>
+        </w:rPr>
+        <w:t xml:space="preserve"> method. If you want to pass a variable that has an array data, then it must be associative array to show specific data of array on view otherwise foreach loop will display all data of array.</w:t>
+      </w:r>
+    </w:p>
+    <w:p>
+      <w:pPr>
+        <w:spacing w:after="0" w:line="240" w:lineRule="auto"/>
+        <w:rPr>
+          <w:rFonts w:cstheme="minorHAnsi"/>
+          <w:sz w:val="24"/>
+          <w:szCs w:val="24"/>
+        </w:rPr>
+      </w:pPr>
+      <w:r>
+        <w:rPr>
+          <w:rFonts w:cstheme="minorHAnsi"/>
+          <w:b/>
+          <w:bCs/>
+          <w:sz w:val="24"/>
+          <w:szCs w:val="24"/>
+        </w:rPr>
+        <w:t xml:space="preserve">Why </w:t>
+      </w:r>
+      <w:r>
+        <w:rPr>
+          <w:rFonts w:cstheme="minorHAnsi"/>
+          <w:b/>
+          <w:bCs/>
+          <w:sz w:val="24"/>
+          <w:szCs w:val="24"/>
+        </w:rPr>
+        <w:t>With</w:t>
+      </w:r>
+      <w:r>
+        <w:rPr>
+          <w:rFonts w:cstheme="minorHAnsi"/>
+          <w:b/>
+          <w:bCs/>
+          <w:sz w:val="24"/>
+          <w:szCs w:val="24"/>
+        </w:rPr>
+        <w:t>:</w:t>
+      </w:r>
+      <w:r>
+        <w:rPr>
+          <w:rFonts w:cstheme="minorHAnsi"/>
+          <w:sz w:val="24"/>
+          <w:szCs w:val="24"/>
+        </w:rPr>
+        <w:t xml:space="preserve"> When we want to pass variable with </w:t>
+      </w:r>
+      <w:r>
+        <w:rPr>
+          <w:rFonts w:cstheme="minorHAnsi"/>
+          <w:sz w:val="24"/>
+          <w:szCs w:val="24"/>
+        </w:rPr>
+        <w:t>differ</w:t>
+      </w:r>
+      <w:r>
+        <w:rPr>
+          <w:rFonts w:cstheme="minorHAnsi"/>
+          <w:sz w:val="24"/>
+          <w:szCs w:val="24"/>
+        </w:rPr>
+        <w:t xml:space="preserve"> name that we declared to store value</w:t>
+      </w:r>
+    </w:p>
+    <w:p>
+      <w:pPr>
+        <w:spacing w:after="0" w:line="240" w:lineRule="auto"/>
+        <w:rPr>
+          <w:rFonts w:cstheme="minorHAnsi"/>
+          <w:sz w:val="24"/>
+          <w:szCs w:val="24"/>
+        </w:rPr>
+      </w:pPr>
+      <w:r>
+        <w:rPr>
+          <w:rFonts w:cstheme="minorHAnsi"/>
+          <w:b/>
+          <w:bCs/>
+          <w:sz w:val="24"/>
+          <w:szCs w:val="24"/>
+        </w:rPr>
+        <w:t>Redirect:</w:t>
+      </w:r>
+      <w:r>
+        <w:rPr>
+          <w:rFonts w:cstheme="minorHAnsi"/>
+          <w:sz w:val="24"/>
+          <w:szCs w:val="24"/>
+        </w:rPr>
+        <w:t xml:space="preserve"> </w:t>
+      </w:r>
+      <w:r>
+        <w:rPr>
+          <w:rFonts w:cstheme="minorHAnsi"/>
+          <w:sz w:val="24"/>
+          <w:szCs w:val="24"/>
+        </w:rPr>
+        <w:t xml:space="preserve">In redirect we must pass the route name like </w:t>
+      </w:r>
+      <w:r>
+        <w:rPr>
+          <w:rFonts w:cstheme="minorHAnsi"/>
+          <w:sz w:val="24"/>
+          <w:szCs w:val="24"/>
+        </w:rPr>
+        <w:t>URL.</w:t>
+      </w:r>
+    </w:p>
+    <w:p>
+      <w:pPr>
+        <w:spacing w:after="0" w:line="240" w:lineRule="auto"/>
+        <w:rPr>
+          <w:rFonts w:cstheme="minorHAnsi"/>
+          <w:sz w:val="24"/>
+          <w:szCs w:val="24"/>
+        </w:rPr>
+      </w:pPr>
+      <w:r>
+        <w:rPr>
+          <w:rFonts w:cstheme="minorHAnsi"/>
+          <w:b/>
+          <w:bCs/>
+          <w:sz w:val="24"/>
+          <w:szCs w:val="24"/>
+        </w:rPr>
+        <w:t>View:</w:t>
+      </w:r>
+      <w:r>
+        <w:rPr>
+          <w:rFonts w:cstheme="minorHAnsi"/>
+          <w:sz w:val="24"/>
+          <w:szCs w:val="24"/>
+        </w:rPr>
+        <w:t xml:space="preserve"> In view we must pass the file(view) name not route </w:t>
+      </w:r>
+      <w:r>
+        <w:rPr>
+          <w:rFonts w:cstheme="minorHAnsi"/>
+          <w:sz w:val="24"/>
+          <w:szCs w:val="24"/>
+        </w:rPr>
+        <w:t>URL</w:t>
+      </w:r>
+      <w:r>
+        <w:rPr>
+          <w:rFonts w:cstheme="minorHAnsi"/>
+          <w:sz w:val="24"/>
+          <w:szCs w:val="24"/>
+        </w:rPr>
+        <w:t>.</w:t>
+      </w:r>
+    </w:p>
+    <w:p>
+      <w:pPr>
+        <w:spacing w:after="0" w:line="240" w:lineRule="auto"/>
+        <w:rPr>
+          <w:rFonts w:cstheme="minorHAnsi"/>
+          <w:sz w:val="24"/>
+          <w:szCs w:val="24"/>
+        </w:rPr>
+      </w:pPr>
+      <w:r>
+        <w:rPr>
+          <w:rFonts w:cstheme="minorHAnsi"/>
+          <w:b/>
+          <w:bCs/>
+          <w:sz w:val="24"/>
+          <w:szCs w:val="24"/>
+        </w:rPr>
+        <w:t>Migration:</w:t>
+      </w:r>
+      <w:r>
+        <w:rPr>
+          <w:rFonts w:cstheme="minorHAnsi"/>
+          <w:sz w:val="24"/>
+          <w:szCs w:val="24"/>
+        </w:rPr>
+        <w:t xml:space="preserve"> Use </w:t>
+      </w:r>
+      <w:r>
+        <w:rPr>
+          <w:rFonts w:cstheme="minorHAnsi"/>
+          <w:b/>
+          <w:bCs/>
+          <w:sz w:val="20"/>
+          <w:szCs w:val="20"/>
+        </w:rPr>
+        <w:t xml:space="preserve">php artisan make: migration </w:t>
+      </w:r>
+      <w:proofErr w:type="spellStart"/>
+      <w:r>
+        <w:rPr>
+          <w:rFonts w:cstheme="minorHAnsi"/>
+          <w:b/>
+          <w:bCs/>
+          <w:sz w:val="20"/>
+          <w:szCs w:val="20"/>
+        </w:rPr>
+        <w:t>create_tableName_table</w:t>
+      </w:r>
+      <w:proofErr w:type="spellEnd"/>
+      <w:r>
+        <w:rPr>
+          <w:rFonts w:cstheme="minorHAnsi"/>
+          <w:sz w:val="20"/>
+          <w:szCs w:val="20"/>
+        </w:rPr>
+        <w:t xml:space="preserve"> </w:t>
+      </w:r>
+      <w:r>
+        <w:rPr>
+          <w:rFonts w:cstheme="minorHAnsi"/>
+          <w:sz w:val="24"/>
+          <w:szCs w:val="24"/>
+        </w:rPr>
+        <w:t>to create tables in database. Table name should be plural mean it should be ‘s’ at the end of table name.</w:t>
+      </w:r>
+      <w:r>
+        <w:rPr>
+          <w:rFonts w:cstheme="minorHAnsi"/>
+          <w:sz w:val="24"/>
+          <w:szCs w:val="24"/>
+        </w:rPr>
+        <w:t xml:space="preserve"> For primary key just pass column name like </w:t>
+      </w:r>
+      <w:r>
+        <w:rPr>
+          <w:rFonts w:cstheme="minorHAnsi"/>
+          <w:b/>
+          <w:bCs/>
+          <w:sz w:val="20"/>
+          <w:szCs w:val="20"/>
+        </w:rPr>
+        <w:t>$table-&gt;id(‘student_id’);</w:t>
+      </w:r>
+      <w:r>
+        <w:rPr>
+          <w:rFonts w:cstheme="minorHAnsi"/>
+          <w:b/>
+          <w:bCs/>
+          <w:sz w:val="20"/>
+          <w:szCs w:val="20"/>
+        </w:rPr>
+        <w:t xml:space="preserve"> </w:t>
+      </w:r>
+      <w:r>
+        <w:rPr>
+          <w:rFonts w:cstheme="minorHAnsi"/>
+          <w:sz w:val="24"/>
+          <w:szCs w:val="24"/>
+        </w:rPr>
+        <w:t>For varchar values, use string like $table-&gt;string(‘name’);</w:t>
+      </w:r>
+    </w:p>
+    <w:p>
+      <w:pPr>
+        <w:spacing w:after="0" w:line="240" w:lineRule="auto"/>
+        <w:rPr>
+          <w:rFonts w:cstheme="minorHAnsi"/>
+          <w:b/>
+          <w:bCs/>
+          <w:sz w:val="20"/>
+          <w:szCs w:val="20"/>
+        </w:rPr>
+      </w:pPr>
+      <w:r>
+        <w:rPr>
+          <w:rFonts w:cstheme="minorHAnsi"/>
+          <w:sz w:val="24"/>
+          <w:szCs w:val="24"/>
+        </w:rPr>
+        <w:t xml:space="preserve">For foreign key </w:t>
+      </w:r>
+      <w:r>
+        <w:rPr>
+          <w:rFonts w:cstheme="minorHAnsi"/>
+          <w:sz w:val="24"/>
+          <w:szCs w:val="24"/>
+        </w:rPr>
+        <w:t xml:space="preserve">first create that column with UnsignedBigInteger and then make it foreign key like </w:t>
+      </w:r>
+      <w:r>
+        <w:rPr>
+          <w:rFonts w:cstheme="minorHAnsi"/>
+          <w:b/>
+          <w:bCs/>
+          <w:sz w:val="20"/>
+          <w:szCs w:val="20"/>
+        </w:rPr>
+        <w:t>$table-&gt;unsignedBigInteger(‘s_id’)</w:t>
+      </w:r>
+      <w:r>
+        <w:rPr>
+          <w:rFonts w:cstheme="minorHAnsi"/>
+          <w:sz w:val="24"/>
+          <w:szCs w:val="24"/>
+        </w:rPr>
+        <w:t>;</w:t>
+      </w:r>
+      <w:r>
+        <w:t xml:space="preserve"> </w:t>
+      </w:r>
+      <w:r>
+        <w:t xml:space="preserve">then </w:t>
+      </w:r>
+      <w:r>
+        <w:rPr>
+          <w:rFonts w:cstheme="minorHAnsi"/>
+          <w:b/>
+          <w:bCs/>
+          <w:sz w:val="20"/>
+          <w:szCs w:val="20"/>
+        </w:rPr>
+        <w:t>$table-&gt;foreign('s_id')-&gt;references('student_id')</w:t>
+      </w:r>
+    </w:p>
+    <w:p>
+      <w:pPr>
+        <w:spacing w:after="0" w:line="240" w:lineRule="auto"/>
+        <w:rPr>
+          <w:rFonts w:cstheme="minorHAnsi"/>
+          <w:sz w:val="24"/>
+          <w:szCs w:val="24"/>
+        </w:rPr>
+      </w:pPr>
+      <w:r>
+        <w:rPr>
+          <w:rFonts w:cstheme="minorHAnsi"/>
+          <w:b/>
+          <w:bCs/>
+          <w:sz w:val="20"/>
+          <w:szCs w:val="20"/>
+        </w:rPr>
+        <w:t>-&gt;on('reference table name');</w:t>
+      </w:r>
+      <w:r>
+        <w:rPr>
+          <w:rFonts w:cstheme="minorHAnsi"/>
+          <w:b/>
+          <w:bCs/>
+          <w:sz w:val="20"/>
+          <w:szCs w:val="20"/>
+        </w:rPr>
+        <w:t xml:space="preserve"> </w:t>
+      </w:r>
+      <w:r>
+        <w:rPr>
+          <w:rFonts w:cstheme="minorHAnsi"/>
+          <w:sz w:val="24"/>
+          <w:szCs w:val="24"/>
+        </w:rPr>
+        <w:t xml:space="preserve">At the end run </w:t>
+      </w:r>
+      <w:r>
+        <w:rPr>
+          <w:rFonts w:cstheme="minorHAnsi"/>
+          <w:b/>
+          <w:bCs/>
+          <w:sz w:val="20"/>
+          <w:szCs w:val="20"/>
+        </w:rPr>
+        <w:t>php artisan migrate</w:t>
+      </w:r>
+      <w:r>
+        <w:rPr>
+          <w:rFonts w:cstheme="minorHAnsi"/>
+          <w:sz w:val="20"/>
+          <w:szCs w:val="20"/>
+        </w:rPr>
+        <w:t xml:space="preserve"> </w:t>
+      </w:r>
+      <w:r>
+        <w:rPr>
+          <w:rFonts w:cstheme="minorHAnsi"/>
+          <w:sz w:val="24"/>
+          <w:szCs w:val="24"/>
+        </w:rPr>
+        <w:t>to create tables in database.</w:t>
+      </w:r>
+      <w:r>
+        <w:rPr>
+          <w:rFonts w:cstheme="minorHAnsi"/>
+          <w:sz w:val="24"/>
+          <w:szCs w:val="24"/>
+        </w:rPr>
+        <w:t xml:space="preserve"> </w:t>
+      </w:r>
+      <w:r>
+        <w:rPr>
+          <w:rFonts w:cstheme="minorHAnsi"/>
+          <w:sz w:val="24"/>
+          <w:szCs w:val="24"/>
+        </w:rPr>
+        <w:t xml:space="preserve">For delete migrated tables use php artisan </w:t>
+      </w:r>
+      <w:proofErr w:type="spellStart"/>
+      <w:r>
+        <w:rPr>
+          <w:rFonts w:cstheme="minorHAnsi"/>
+          <w:b/>
+          <w:bCs/>
+          <w:sz w:val="20"/>
+          <w:szCs w:val="20"/>
+        </w:rPr>
+        <w:t>migrate:reset</w:t>
+      </w:r>
+      <w:proofErr w:type="spellEnd"/>
+      <w:r>
+        <w:rPr>
+          <w:rFonts w:cstheme="minorHAnsi"/>
+          <w:sz w:val="24"/>
+          <w:szCs w:val="24"/>
+        </w:rPr>
+        <w:t xml:space="preserve">. For remove last migration use </w:t>
+      </w:r>
+      <w:r>
+        <w:rPr>
+          <w:rFonts w:cstheme="minorHAnsi"/>
+          <w:b/>
+          <w:bCs/>
+          <w:sz w:val="20"/>
+          <w:szCs w:val="20"/>
+        </w:rPr>
+        <w:t>rollback</w:t>
+      </w:r>
+      <w:r>
+        <w:rPr>
+          <w:rFonts w:cstheme="minorHAnsi"/>
+          <w:sz w:val="24"/>
+          <w:szCs w:val="24"/>
+        </w:rPr>
+        <w:t>.</w:t>
+      </w:r>
+      <w:r>
+        <w:rPr>
+          <w:rFonts w:cstheme="minorHAnsi"/>
+          <w:sz w:val="24"/>
+          <w:szCs w:val="24"/>
+        </w:rPr>
+        <w:t xml:space="preserve"> For remove specific step migration mean you run 5 migration commands and want to delete 3 number migration then use </w:t>
+      </w:r>
+      <w:r>
+        <w:rPr>
+          <w:rFonts w:cstheme="minorHAnsi"/>
+          <w:b/>
+          <w:bCs/>
+          <w:sz w:val="20"/>
+          <w:szCs w:val="20"/>
+        </w:rPr>
+        <w:t>rollback --step 3</w:t>
+      </w:r>
+      <w:r>
+        <w:rPr>
+          <w:rFonts w:cstheme="minorHAnsi"/>
+          <w:sz w:val="24"/>
+          <w:szCs w:val="24"/>
+        </w:rPr>
+        <w:t xml:space="preserve">. </w:t>
+      </w:r>
+      <w:r>
+        <w:rPr>
+          <w:rFonts w:cstheme="minorHAnsi"/>
+          <w:b/>
+          <w:bCs/>
+          <w:sz w:val="20"/>
+          <w:szCs w:val="20"/>
+        </w:rPr>
+        <w:t>Refresh</w:t>
+      </w:r>
+      <w:r>
+        <w:rPr>
+          <w:rFonts w:cstheme="minorHAnsi"/>
+          <w:sz w:val="24"/>
+          <w:szCs w:val="24"/>
+        </w:rPr>
+        <w:t xml:space="preserve"> first delete all tables and then create all again. For run single file  </w:t>
+      </w:r>
+      <w:r>
+        <w:rPr>
+          <w:rFonts w:cstheme="minorHAnsi"/>
+          <w:b/>
+          <w:bCs/>
+          <w:sz w:val="20"/>
+          <w:szCs w:val="20"/>
+        </w:rPr>
+        <w:t>migrate --path=/database/migrations/file name.</w:t>
+      </w:r>
+    </w:p>
+    <w:p>
+      <w:pPr>
+        <w:spacing w:after="0" w:line="240" w:lineRule="auto"/>
+        <w:rPr>
+          <w:rFonts w:cstheme="minorHAnsi"/>
+          <w:b/>
+          <w:bCs/>
+          <w:sz w:val="20"/>
+          <w:szCs w:val="20"/>
+        </w:rPr>
+      </w:pPr>
+      <w:r>
+        <w:rPr>
+          <w:rFonts w:cstheme="minorHAnsi"/>
+          <w:b/>
+          <w:bCs/>
+          <w:sz w:val="24"/>
+          <w:szCs w:val="24"/>
+        </w:rPr>
+        <w:t>Seeder:</w:t>
+      </w:r>
+      <w:r>
+        <w:rPr>
+          <w:rFonts w:cstheme="minorHAnsi"/>
+          <w:sz w:val="24"/>
+          <w:szCs w:val="24"/>
+        </w:rPr>
+        <w:t xml:space="preserve"> Used for enter data in tables, Use </w:t>
+      </w:r>
+      <w:r>
+        <w:rPr>
+          <w:rFonts w:cstheme="minorHAnsi"/>
+          <w:b/>
+          <w:bCs/>
+          <w:sz w:val="20"/>
+          <w:szCs w:val="20"/>
+        </w:rPr>
+        <w:t xml:space="preserve">php artisan make: </w:t>
+      </w:r>
+      <w:r>
+        <w:rPr>
+          <w:rFonts w:cstheme="minorHAnsi"/>
+          <w:b/>
+          <w:bCs/>
+          <w:sz w:val="20"/>
+          <w:szCs w:val="20"/>
+        </w:rPr>
+        <w:t>seeder</w:t>
+      </w:r>
+      <w:r>
+        <w:rPr>
+          <w:rFonts w:cstheme="minorHAnsi"/>
+          <w:b/>
+          <w:bCs/>
+          <w:sz w:val="20"/>
+          <w:szCs w:val="20"/>
+        </w:rPr>
+        <w:t xml:space="preserve"> </w:t>
+      </w:r>
+      <w:r>
+        <w:rPr>
+          <w:rFonts w:cstheme="minorHAnsi"/>
+          <w:b/>
+          <w:bCs/>
+          <w:sz w:val="20"/>
+          <w:szCs w:val="20"/>
+        </w:rPr>
+        <w:t>seeder</w:t>
+      </w:r>
+      <w:r>
+        <w:rPr>
+          <w:rFonts w:cstheme="minorHAnsi"/>
+          <w:b/>
+          <w:bCs/>
+          <w:sz w:val="20"/>
+          <w:szCs w:val="20"/>
+        </w:rPr>
+        <w:t>Name</w:t>
+      </w:r>
+      <w:r>
+        <w:rPr>
+          <w:rFonts w:cstheme="minorHAnsi"/>
+          <w:b/>
+          <w:bCs/>
+          <w:sz w:val="20"/>
+          <w:szCs w:val="20"/>
+        </w:rPr>
+        <w:t xml:space="preserve">Seeder. </w:t>
+      </w:r>
+      <w:r>
+        <w:rPr>
+          <w:rFonts w:cstheme="minorHAnsi"/>
+          <w:sz w:val="24"/>
+          <w:szCs w:val="24"/>
+        </w:rPr>
+        <w:t xml:space="preserve">There must be used seeder at </w:t>
+      </w:r>
+      <w:r>
+        <w:rPr>
+          <w:rFonts w:cstheme="minorHAnsi"/>
+          <w:sz w:val="24"/>
+          <w:szCs w:val="24"/>
+        </w:rPr>
+        <w:t>t</w:t>
+      </w:r>
+      <w:r>
+        <w:rPr>
+          <w:rFonts w:cstheme="minorHAnsi"/>
+          <w:sz w:val="24"/>
+          <w:szCs w:val="24"/>
+        </w:rPr>
+        <w:t>he end of seeder name</w:t>
+      </w:r>
+      <w:r>
+        <w:rPr>
+          <w:rFonts w:cstheme="minorHAnsi"/>
+          <w:sz w:val="24"/>
+          <w:szCs w:val="24"/>
+        </w:rPr>
+        <w:t xml:space="preserve">. Use create method in seeder to put data in tables. </w:t>
+      </w:r>
+      <w:r>
+        <w:rPr>
+          <w:rFonts w:cstheme="minorHAnsi"/>
+          <w:sz w:val="24"/>
+          <w:szCs w:val="24"/>
+        </w:rPr>
+        <w:t xml:space="preserve">Then call seeder in database seeder file like </w:t>
+      </w:r>
+      <w:r>
+        <w:rPr>
+          <w:rFonts w:cstheme="minorHAnsi"/>
+          <w:sz w:val="24"/>
+          <w:szCs w:val="24"/>
+        </w:rPr>
+        <w:t xml:space="preserve">$this-&gt;call([ </w:t>
+      </w:r>
+      <w:r>
+        <w:rPr>
+          <w:rFonts w:cstheme="minorHAnsi"/>
+          <w:sz w:val="24"/>
+          <w:szCs w:val="24"/>
+        </w:rPr>
+        <w:t>seederName</w:t>
+      </w:r>
+      <w:r>
+        <w:rPr>
+          <w:rFonts w:cstheme="minorHAnsi"/>
+          <w:sz w:val="24"/>
+          <w:szCs w:val="24"/>
+        </w:rPr>
+        <w:t>::class]);</w:t>
+      </w:r>
+      <w:r>
+        <w:rPr>
+          <w:rFonts w:cstheme="minorHAnsi"/>
+          <w:sz w:val="24"/>
+          <w:szCs w:val="24"/>
+        </w:rPr>
+        <w:t xml:space="preserve"> and run </w:t>
+      </w:r>
+      <w:r>
+        <w:rPr>
+          <w:rFonts w:cstheme="minorHAnsi"/>
+          <w:b/>
+          <w:bCs/>
+          <w:sz w:val="20"/>
+          <w:szCs w:val="20"/>
+        </w:rPr>
+        <w:t>php artisan db:seed</w:t>
+      </w:r>
+      <w:r>
+        <w:rPr>
+          <w:rFonts w:cstheme="minorHAnsi"/>
+          <w:b/>
+          <w:bCs/>
+          <w:sz w:val="20"/>
+          <w:szCs w:val="20"/>
+        </w:rPr>
+        <w:t>.</w:t>
+      </w:r>
+    </w:p>
+    <w:p>
+      <w:pPr>
+        <w:spacing w:after="0" w:line="240" w:lineRule="auto"/>
+        <w:rPr>
+          <w:rFonts w:cstheme="minorHAnsi"/>
+          <w:sz w:val="24"/>
+          <w:szCs w:val="24"/>
+        </w:rPr>
+      </w:pPr>
+      <w:r>
+        <w:rPr>
+          <w:rFonts w:cstheme="minorHAnsi"/>
+          <w:b/>
+          <w:bCs/>
+          <w:sz w:val="24"/>
+          <w:szCs w:val="24"/>
+        </w:rPr>
+        <w:t>Validation:</w:t>
+      </w:r>
+      <w:r>
+        <w:rPr>
+          <w:rFonts w:cstheme="minorHAnsi"/>
+          <w:sz w:val="24"/>
+          <w:szCs w:val="24"/>
+        </w:rPr>
+        <w:t xml:space="preserve"> $request-&gt;validate([ ‘input_field_name’=&gt;’required|email|numeric’]); and show it on view like @error (‘input_field_name’) &lt;span&gt;{{$message}}&lt;/span&gt; @enderror.</w:t>
+      </w:r>
+    </w:p>
+    <w:p>
+      <w:pPr>
+        <w:spacing w:after="0" w:line="240" w:lineRule="auto"/>
+        <w:rPr>
+          <w:rFonts w:cstheme="minorHAnsi"/>
+          <w:sz w:val="24"/>
+          <w:szCs w:val="24"/>
+        </w:rPr>
+      </w:pPr>
+      <w:r>
+        <w:rPr>
+          <w:rFonts w:cstheme="minorHAnsi"/>
+          <w:b/>
+          <w:bCs/>
+          <w:sz w:val="24"/>
+          <w:szCs w:val="24"/>
+        </w:rPr>
+        <w:lastRenderedPageBreak/>
+        <w:t>Create:</w:t>
+      </w:r>
+      <w:r>
+        <w:rPr>
+          <w:rFonts w:cstheme="minorHAnsi"/>
+          <w:sz w:val="24"/>
+          <w:szCs w:val="24"/>
+        </w:rPr>
+        <w:t xml:space="preserve"> </w:t>
+      </w:r>
+      <w:r>
+        <w:rPr>
+          <w:rFonts w:cstheme="minorHAnsi"/>
+          <w:b/>
+          <w:bCs/>
+          <w:sz w:val="20"/>
+          <w:szCs w:val="20"/>
+        </w:rPr>
+        <w:t>model_name::create([ ‘database column’=&gt;$request-&gt;input_field_name]);</w:t>
+      </w:r>
+      <w:r>
+        <w:rPr>
+          <w:rFonts w:cstheme="minorHAnsi"/>
+          <w:sz w:val="20"/>
+          <w:szCs w:val="20"/>
+        </w:rPr>
+        <w:t xml:space="preserve"> </w:t>
+      </w:r>
+      <w:r>
+        <w:rPr>
+          <w:rFonts w:cstheme="minorHAnsi"/>
+          <w:sz w:val="24"/>
+          <w:szCs w:val="24"/>
+        </w:rPr>
+        <w:t>Remember, the database field must be fillable in model before inserting data.</w:t>
+      </w:r>
+    </w:p>
+    <w:p>
+      <w:pPr>
+        <w:spacing w:after="0" w:line="240" w:lineRule="auto"/>
+        <w:rPr>
+          <w:rFonts w:cstheme="minorHAnsi"/>
+          <w:b/>
+          <w:bCs/>
+          <w:sz w:val="20"/>
+          <w:szCs w:val="20"/>
+        </w:rPr>
+      </w:pPr>
+      <w:r>
+        <w:rPr>
+          <w:rFonts w:cstheme="minorHAnsi"/>
+          <w:b/>
+          <w:bCs/>
+          <w:sz w:val="24"/>
+          <w:szCs w:val="24"/>
+        </w:rPr>
+        <w:t>Delete:</w:t>
+      </w:r>
+      <w:r>
+        <w:rPr>
+          <w:rFonts w:cstheme="minorHAnsi"/>
+          <w:sz w:val="24"/>
+          <w:szCs w:val="24"/>
+        </w:rPr>
+        <w:t xml:space="preserve"> </w:t>
+      </w:r>
+      <w:r>
+        <w:rPr>
+          <w:rFonts w:cstheme="minorHAnsi"/>
+          <w:b/>
+          <w:bCs/>
+          <w:sz w:val="20"/>
+          <w:szCs w:val="20"/>
+        </w:rPr>
+        <w:t>$dataForDeletion = Companies::where('company_id', $companyId);</w:t>
+      </w:r>
+      <w:r>
+        <w:rPr>
+          <w:rFonts w:cstheme="minorHAnsi"/>
+          <w:b/>
+          <w:bCs/>
+          <w:sz w:val="20"/>
+          <w:szCs w:val="20"/>
+        </w:rPr>
+        <w:t xml:space="preserve"> </w:t>
+      </w:r>
+      <w:r>
+        <w:rPr>
+          <w:rFonts w:cstheme="minorHAnsi"/>
+          <w:b/>
+          <w:bCs/>
+          <w:sz w:val="20"/>
+          <w:szCs w:val="20"/>
+        </w:rPr>
+        <w:t>$dataForDeletion-&gt;Delete();</w:t>
+      </w:r>
+    </w:p>
+    <w:p>
+      <w:pPr>
+        <w:spacing w:after="0" w:line="240" w:lineRule="auto"/>
+        <w:rPr>
+          <w:rFonts w:cstheme="minorHAnsi"/>
+          <w:sz w:val="24"/>
+          <w:szCs w:val="24"/>
+        </w:rPr>
+      </w:pPr>
+      <w:r>
+        <w:rPr>
+          <w:rFonts w:cstheme="minorHAnsi"/>
+          <w:b/>
+          <w:bCs/>
+          <w:sz w:val="24"/>
+          <w:szCs w:val="24"/>
+        </w:rPr>
+        <w:t>Update:</w:t>
+      </w:r>
+      <w:r>
+        <w:rPr>
+          <w:rFonts w:cstheme="minorHAnsi"/>
+          <w:sz w:val="24"/>
+          <w:szCs w:val="24"/>
+        </w:rPr>
+        <w:t xml:space="preserve"> </w:t>
+      </w:r>
+      <w:r>
+        <w:rPr>
+          <w:rFonts w:cstheme="minorHAnsi"/>
+          <w:b/>
+          <w:bCs/>
+          <w:sz w:val="20"/>
+          <w:szCs w:val="20"/>
+        </w:rPr>
+        <w:t>$</w:t>
+      </w:r>
+      <w:r>
+        <w:rPr>
+          <w:rFonts w:cstheme="minorHAnsi"/>
+          <w:b/>
+          <w:bCs/>
+          <w:sz w:val="20"/>
+          <w:szCs w:val="20"/>
+        </w:rPr>
+        <w:t>d</w:t>
+      </w:r>
+      <w:r>
+        <w:rPr>
+          <w:rFonts w:cstheme="minorHAnsi"/>
+          <w:b/>
+          <w:bCs/>
+          <w:sz w:val="20"/>
+          <w:szCs w:val="20"/>
+        </w:rPr>
+        <w:t>ata = Companies::where('company_id', $request-&gt;companyId);</w:t>
+      </w:r>
+    </w:p>
+    <w:p>
+      <w:pPr>
+        <w:spacing w:after="0" w:line="240" w:lineRule="auto"/>
+        <w:rPr>
+          <w:rFonts w:cstheme="minorHAnsi"/>
+          <w:sz w:val="24"/>
+          <w:szCs w:val="24"/>
+        </w:rPr>
+      </w:pPr>
+      <w:r>
+        <w:rPr>
+          <w:rFonts w:cstheme="minorHAnsi"/>
+          <w:b/>
+          <w:bCs/>
+          <w:sz w:val="20"/>
+          <w:szCs w:val="20"/>
+        </w:rPr>
+        <w:t>$data-&gt;update</w:t>
+      </w:r>
+      <w:r>
+        <w:rPr>
+          <w:rFonts w:cstheme="minorHAnsi"/>
+          <w:b/>
+          <w:bCs/>
+          <w:sz w:val="20"/>
+          <w:szCs w:val="20"/>
+        </w:rPr>
+        <w:t>([ ‘database column’=&gt;$request-&gt;input_field_name]);</w:t>
+      </w:r>
+    </w:p>
+    <w:p>
+      <w:pPr>
+        <w:spacing w:after="0" w:line="240" w:lineRule="auto"/>
+        <w:rPr>
+          <w:rFonts w:cstheme="minorHAnsi"/>
+          <w:sz w:val="24"/>
+          <w:szCs w:val="24"/>
+        </w:rPr>
+      </w:pPr>
+      <w:r>
+        <w:rPr>
+          <w:rFonts w:cstheme="minorHAnsi"/>
+          <w:b/>
+          <w:bCs/>
+          <w:sz w:val="24"/>
+          <w:szCs w:val="24"/>
+        </w:rPr>
+        <w:t>PUT:</w:t>
+      </w:r>
+      <w:r>
+        <w:rPr>
+          <w:rFonts w:cstheme="minorHAnsi"/>
+          <w:sz w:val="24"/>
+          <w:szCs w:val="24"/>
+        </w:rPr>
+        <w:t xml:space="preserve"> Put method is used for update data. </w:t>
+      </w:r>
+      <w:r>
+        <w:rPr>
+          <w:rFonts w:cstheme="minorHAnsi"/>
+          <w:sz w:val="24"/>
+          <w:szCs w:val="24"/>
+        </w:rPr>
+        <w:t>When we use it in route, we write @method(‘PUT’) at below of @csrf in view. However, the method in form will be post.</w:t>
+      </w:r>
+    </w:p>
+    <w:p>
+      <w:pPr>
+        <w:spacing w:after="0" w:line="240" w:lineRule="auto"/>
+        <w:rPr>
+          <w:rFonts w:cstheme="minorHAnsi"/>
+          <w:sz w:val="24"/>
+          <w:szCs w:val="24"/>
+        </w:rPr>
+      </w:pPr>
+      <w:r>
+        <w:rPr>
+          <w:rFonts w:cstheme="minorHAnsi"/>
+          <w:b/>
+          <w:bCs/>
+          <w:sz w:val="24"/>
+          <w:szCs w:val="24"/>
+        </w:rPr>
+        <w:t>Y</w:t>
+      </w:r>
+      <w:r>
+        <w:rPr>
+          <w:rFonts w:cstheme="minorHAnsi"/>
+          <w:b/>
+          <w:bCs/>
+          <w:sz w:val="24"/>
+          <w:szCs w:val="24"/>
+        </w:rPr>
+        <w:t>ajra Da</w:t>
+      </w:r>
+      <w:r>
+        <w:rPr>
+          <w:rFonts w:cstheme="minorHAnsi"/>
+          <w:b/>
+          <w:bCs/>
+          <w:sz w:val="24"/>
+          <w:szCs w:val="24"/>
+        </w:rPr>
+        <w:t>taTables:</w:t>
+      </w:r>
+      <w:r>
+        <w:rPr>
+          <w:rFonts w:cstheme="minorHAnsi"/>
+          <w:sz w:val="24"/>
+          <w:szCs w:val="24"/>
+        </w:rPr>
+        <w:t xml:space="preserve"> </w:t>
+      </w:r>
+      <w:r>
+        <w:rPr>
+          <w:rFonts w:cstheme="minorHAnsi"/>
+          <w:b/>
+          <w:bCs/>
+          <w:sz w:val="20"/>
+          <w:szCs w:val="20"/>
+        </w:rPr>
+        <w:t>composer require yajra/laravel-datatables-oracle</w:t>
+      </w:r>
+      <w:r>
+        <w:rPr>
+          <w:rFonts w:cstheme="minorHAnsi"/>
+          <w:b/>
+          <w:bCs/>
+          <w:sz w:val="20"/>
+          <w:szCs w:val="20"/>
+        </w:rPr>
+        <w:t xml:space="preserve"> </w:t>
+      </w:r>
+      <w:r>
+        <w:rPr>
+          <w:rFonts w:cstheme="minorHAnsi"/>
+          <w:sz w:val="24"/>
+          <w:szCs w:val="24"/>
+        </w:rPr>
+        <w:t>then</w:t>
+      </w:r>
+      <w:r>
+        <w:rPr>
+          <w:rFonts w:cstheme="minorHAnsi"/>
+          <w:sz w:val="24"/>
+          <w:szCs w:val="24"/>
+        </w:rPr>
+        <w:t xml:space="preserve"> open app.php from config folder and add command in </w:t>
+      </w:r>
+      <w:r>
+        <w:rPr>
+          <w:rFonts w:cstheme="minorHAnsi"/>
+          <w:sz w:val="24"/>
+          <w:szCs w:val="24"/>
+        </w:rPr>
+        <w:t>providers</w:t>
+      </w:r>
+      <w:r>
+        <w:rPr>
+          <w:rFonts w:cstheme="minorHAnsi"/>
+          <w:sz w:val="24"/>
+          <w:szCs w:val="24"/>
+        </w:rPr>
+        <w:t xml:space="preserve"> </w:t>
+      </w:r>
+      <w:r>
+        <w:rPr>
+          <w:rFonts w:cstheme="minorHAnsi"/>
+          <w:b/>
+          <w:bCs/>
+          <w:sz w:val="20"/>
+          <w:szCs w:val="20"/>
+        </w:rPr>
+        <w:t>Yajra\DataTables\DataTablesServiceProvider::class,</w:t>
+      </w:r>
+      <w:r>
+        <w:rPr>
+          <w:rFonts w:cstheme="minorHAnsi"/>
+          <w:sz w:val="24"/>
+          <w:szCs w:val="24"/>
+        </w:rPr>
+        <w:t xml:space="preserve"> and add command in aliases </w:t>
+      </w:r>
+      <w:r>
+        <w:rPr>
+          <w:rFonts w:cstheme="minorHAnsi"/>
+          <w:b/>
+          <w:bCs/>
+          <w:sz w:val="20"/>
+          <w:szCs w:val="20"/>
+        </w:rPr>
+        <w:t>'DataTables' =&gt; Yajra\DataTables\Facades\DataTables::class,</w:t>
+      </w:r>
+      <w:r>
+        <w:rPr>
+          <w:rFonts w:cstheme="minorHAnsi"/>
+          <w:sz w:val="20"/>
+          <w:szCs w:val="20"/>
+        </w:rPr>
+        <w:t xml:space="preserve"> </w:t>
+      </w:r>
+      <w:r>
+        <w:rPr>
+          <w:rFonts w:cstheme="minorHAnsi"/>
+          <w:sz w:val="24"/>
+          <w:szCs w:val="24"/>
+        </w:rPr>
+        <w:t xml:space="preserve">then run the command </w:t>
+      </w:r>
+      <w:r>
+        <w:rPr>
+          <w:rFonts w:cstheme="minorHAnsi"/>
+          <w:b/>
+          <w:bCs/>
+          <w:sz w:val="20"/>
+          <w:szCs w:val="20"/>
+        </w:rPr>
+        <w:t>php artisan vendor:publish --provider=" Yajra\DataTables\ DataTablesServiceProvider "</w:t>
+      </w:r>
+      <w:r>
+        <w:rPr>
+          <w:rFonts w:cstheme="minorHAnsi"/>
+          <w:b/>
+          <w:bCs/>
+          <w:sz w:val="20"/>
+          <w:szCs w:val="20"/>
+        </w:rPr>
+        <w:t xml:space="preserve">. </w:t>
+      </w:r>
+      <w:r>
+        <w:rPr>
+          <w:rFonts w:cstheme="minorHAnsi"/>
+          <w:sz w:val="24"/>
+          <w:szCs w:val="24"/>
+        </w:rPr>
+        <w:t xml:space="preserve">In controller write </w:t>
+      </w:r>
+      <w:r>
+        <w:rPr>
+          <w:rFonts w:cstheme="minorHAnsi"/>
+          <w:b/>
+          <w:bCs/>
+          <w:sz w:val="20"/>
+          <w:szCs w:val="20"/>
+        </w:rPr>
+        <w:t>$companyData = Companies::all();</w:t>
+      </w:r>
+      <w:r>
+        <w:rPr>
+          <w:rFonts w:cstheme="minorHAnsi"/>
+          <w:b/>
+          <w:bCs/>
+          <w:sz w:val="20"/>
+          <w:szCs w:val="20"/>
+        </w:rPr>
+        <w:t xml:space="preserve"> </w:t>
+      </w:r>
+      <w:r>
+        <w:rPr>
+          <w:rFonts w:cstheme="minorHAnsi"/>
+          <w:b/>
+          <w:bCs/>
+          <w:sz w:val="20"/>
+          <w:szCs w:val="20"/>
+        </w:rPr>
+        <w:t>return Datatables::of($companyData)-&gt;addColumn('action', function ($data) { $button = '&lt;a href="' . route("callEditPage", ["companyId" =&gt; $data-&gt;company_id]) . '"&gt;Edit&lt;/a&gt;'; return $button;})-&gt;make(true);</w:t>
+      </w:r>
+      <w:r>
+        <w:rPr>
+          <w:rFonts w:cstheme="minorHAnsi"/>
+          <w:b/>
+          <w:bCs/>
+          <w:sz w:val="20"/>
+          <w:szCs w:val="20"/>
+        </w:rPr>
+        <w:t xml:space="preserve"> </w:t>
+      </w:r>
+      <w:r>
+        <w:rPr>
+          <w:rFonts w:cstheme="minorHAnsi"/>
+          <w:sz w:val="24"/>
+          <w:szCs w:val="24"/>
+        </w:rPr>
+        <w:t xml:space="preserve">then </w:t>
+      </w:r>
+      <w:r>
+        <w:rPr>
+          <w:rFonts w:cstheme="minorHAnsi"/>
+          <w:sz w:val="24"/>
+          <w:szCs w:val="24"/>
+        </w:rPr>
+        <w:t>add jquery code and files in blade view from documentation.</w:t>
+      </w:r>
+    </w:p>
+    <w:p>
+      <w:pPr>
+        <w:spacing w:after="0" w:line="240" w:lineRule="auto"/>
+        <w:rPr>
+          <w:rFonts w:cstheme="minorHAnsi"/>
+          <w:sz w:val="20"/>
+          <w:szCs w:val="20"/>
+        </w:rPr>
+      </w:pPr>
+      <w:r>
+        <w:rPr>
+          <w:rFonts w:cstheme="minorHAnsi"/>
+          <w:b/>
+          <w:bCs/>
+          <w:sz w:val="24"/>
+          <w:szCs w:val="24"/>
+        </w:rPr>
+        <w:t>Fetch Join Data:</w:t>
+      </w:r>
+      <w:r>
+        <w:rPr>
+          <w:rFonts w:cstheme="minorHAnsi"/>
+          <w:sz w:val="24"/>
+          <w:szCs w:val="24"/>
+        </w:rPr>
+        <w:t xml:space="preserve"> </w:t>
+      </w:r>
+      <w:r>
+        <w:rPr>
+          <w:rFonts w:cstheme="minorHAnsi"/>
+        </w:rPr>
+        <w:t>$employeeData = DB::table('companies') -&gt;join</w:t>
+      </w:r>
+      <w:r>
+        <w:rPr>
+          <w:rFonts w:cstheme="minorHAnsi"/>
+        </w:rPr>
+        <w:t xml:space="preserve"> </w:t>
+      </w:r>
+      <w:r>
+        <w:rPr>
+          <w:rFonts w:cstheme="minorHAnsi"/>
+        </w:rPr>
+        <w:t>('employees',</w:t>
+      </w:r>
+      <w:r>
+        <w:rPr>
+          <w:rFonts w:cstheme="minorHAnsi"/>
+        </w:rPr>
+        <w:t xml:space="preserve"> </w:t>
+      </w:r>
+      <w:r>
+        <w:rPr>
+          <w:rFonts w:cstheme="minorHAnsi"/>
+        </w:rPr>
+        <w:t>'companies.company_id',</w:t>
+      </w:r>
+      <w:r>
+        <w:rPr>
+          <w:rFonts w:cstheme="minorHAnsi"/>
+        </w:rPr>
+        <w:t xml:space="preserve"> </w:t>
+      </w:r>
+      <w:r>
+        <w:rPr>
+          <w:rFonts w:cstheme="minorHAnsi"/>
+        </w:rPr>
+        <w:t>'=',</w:t>
+      </w:r>
+      <w:r>
+        <w:rPr>
+          <w:rFonts w:cstheme="minorHAnsi"/>
+        </w:rPr>
+        <w:t xml:space="preserve"> </w:t>
+      </w:r>
+      <w:r>
+        <w:rPr>
+          <w:rFonts w:cstheme="minorHAnsi"/>
+        </w:rPr>
+        <w:t>'employees.company')-&gt;select('employees.*','companies.name')-&gt;get();</w:t>
+      </w:r>
+    </w:p>
+    <w:p>
+      <w:pPr>
+        <w:spacing w:after="0" w:line="240" w:lineRule="auto"/>
+        <w:rPr>
+          <w:rFonts w:cstheme="minorHAnsi"/>
+          <w:sz w:val="24"/>
+          <w:szCs w:val="24"/>
+        </w:rPr>
+      </w:pPr>
+    </w:p>
+    <w:p>
+      <w:pPr>
+        <w:spacing w:after="0" w:line="240" w:lineRule="auto"/>
+        <w:rPr>
+          <w:rFonts w:cstheme="minorHAnsi"/>
+          <w:sz w:val="24"/>
+          <w:szCs w:val="24"/>
+        </w:rPr>
+      </w:pPr>
+    </w:p>
+    <w:p>
+      <w:pPr>
+        <w:spacing w:after="0" w:line="240" w:lineRule="auto"/>
+        <w:rPr>
+          <w:rFonts w:cstheme="minorHAnsi"/>
+          <w:sz w:val="24"/>
+          <w:szCs w:val="24"/>
+        </w:rPr>
+      </w:pPr>
+    </w:p>
+    <w:p>
+      <w:pPr>
+        <w:spacing w:after="0" w:line="240" w:lineRule="auto"/>
+        <w:rPr>
+          <w:rFonts w:cstheme="minorHAnsi"/>
+          <w:sz w:val="24"/>
+          <w:szCs w:val="24"/>
+        </w:rPr>
+      </w:pPr>
+    </w:p>
+    <w:p>
+      <w:pPr>
+        <w:spacing w:after="0" w:line="240" w:lineRule="auto"/>
+        <w:rPr>
+          <w:rFonts w:cstheme="minorHAnsi"/>
+          <w:sz w:val="24"/>
+          <w:szCs w:val="24"/>
+        </w:rPr>
+      </w:pPr>
+    </w:p>
+    <w:p>
+      <w:pPr>
+        <w:spacing w:after="0" w:line="240" w:lineRule="auto"/>
+        <w:rPr>
+          <w:rFonts w:cstheme="minorHAnsi"/>
+          <w:sz w:val="24"/>
+          <w:szCs w:val="24"/>
+        </w:rPr>
+      </w:pPr>
     </w:p>
     <w:p>
       <w:pPr>
@@ -5983,9 +7916,189 @@
       </w:pPr>
     </w:p>
     <w:p>
-      <w:bookmarkStart w:id="0" w:name="_GoBack"/>
-      <w:bookmarkEnd w:id="0"/>
-    </w:p>
+      <w:pPr>
+        <w:spacing w:before="240"/>
+        <w:jc w:val="center"/>
+        <w:rPr>
+          <w:rFonts w:cstheme="minorHAnsi"/>
+          <w:sz w:val="28"/>
+          <w:szCs w:val="28"/>
+        </w:rPr>
+      </w:pPr>
+      <w:r>
+        <w:rPr>
+          <w:rFonts w:asciiTheme="majorHAnsi" w:hAnsiTheme="majorHAnsi"/>
+          <w:b/>
+          <w:bCs/>
+          <w:i/>
+          <w:iCs/>
+          <w:sz w:val="36"/>
+          <w:szCs w:val="36"/>
+        </w:rPr>
+        <w:t>Git &amp; GitHub</w:t>
+      </w:r>
+    </w:p>
+    <w:p>
+      <w:pPr>
+        <w:spacing w:after="0" w:line="240" w:lineRule="auto"/>
+        <w:rPr>
+          <w:rFonts w:cstheme="minorHAnsi"/>
+          <w:sz w:val="24"/>
+          <w:szCs w:val="24"/>
+        </w:rPr>
+      </w:pPr>
+      <w:r>
+        <w:rPr>
+          <w:rFonts w:cstheme="minorHAnsi"/>
+          <w:b/>
+          <w:bCs/>
+          <w:sz w:val="24"/>
+          <w:szCs w:val="24"/>
+        </w:rPr>
+        <w:t xml:space="preserve">Create Branch: </w:t>
+      </w:r>
+      <w:r>
+        <w:rPr>
+          <w:rFonts w:cstheme="minorHAnsi"/>
+          <w:sz w:val="24"/>
+          <w:szCs w:val="24"/>
+        </w:rPr>
+        <w:t>git checkout -b branch_name</w:t>
+      </w:r>
+    </w:p>
+    <w:p>
+      <w:pPr>
+        <w:spacing w:after="0" w:line="240" w:lineRule="auto"/>
+        <w:rPr>
+          <w:rFonts w:cstheme="minorHAnsi"/>
+          <w:sz w:val="24"/>
+          <w:szCs w:val="24"/>
+        </w:rPr>
+      </w:pPr>
+      <w:r>
+        <w:rPr>
+          <w:rFonts w:cstheme="minorHAnsi"/>
+          <w:b/>
+          <w:bCs/>
+          <w:sz w:val="24"/>
+          <w:szCs w:val="24"/>
+        </w:rPr>
+        <w:t>Delete Branch:</w:t>
+      </w:r>
+      <w:r>
+        <w:rPr>
+          <w:rFonts w:cstheme="minorHAnsi"/>
+          <w:sz w:val="24"/>
+          <w:szCs w:val="24"/>
+        </w:rPr>
+        <w:t xml:space="preserve"> git branch -d branch_name</w:t>
+      </w:r>
+    </w:p>
+    <w:p>
+      <w:pPr>
+        <w:spacing w:after="0" w:line="240" w:lineRule="auto"/>
+        <w:rPr>
+          <w:rFonts w:cstheme="minorHAnsi"/>
+          <w:sz w:val="24"/>
+          <w:szCs w:val="24"/>
+        </w:rPr>
+      </w:pPr>
+      <w:r>
+        <w:rPr>
+          <w:rFonts w:cstheme="minorHAnsi"/>
+          <w:b/>
+          <w:bCs/>
+          <w:sz w:val="24"/>
+          <w:szCs w:val="24"/>
+        </w:rPr>
+        <w:t>Check Branch:</w:t>
+      </w:r>
+      <w:r>
+        <w:rPr>
+          <w:rFonts w:cstheme="minorHAnsi"/>
+          <w:sz w:val="24"/>
+          <w:szCs w:val="24"/>
+        </w:rPr>
+        <w:t xml:space="preserve"> git branch</w:t>
+      </w:r>
+    </w:p>
+    <w:p>
+      <w:pPr>
+        <w:spacing w:after="0" w:line="240" w:lineRule="auto"/>
+        <w:rPr>
+          <w:rFonts w:cstheme="minorHAnsi"/>
+          <w:sz w:val="24"/>
+          <w:szCs w:val="24"/>
+        </w:rPr>
+      </w:pPr>
+      <w:r>
+        <w:rPr>
+          <w:rFonts w:cstheme="minorHAnsi"/>
+          <w:b/>
+          <w:bCs/>
+          <w:sz w:val="24"/>
+          <w:szCs w:val="24"/>
+        </w:rPr>
+        <w:t>Switch Branch:</w:t>
+      </w:r>
+      <w:r>
+        <w:rPr>
+          <w:rFonts w:cstheme="minorHAnsi"/>
+          <w:sz w:val="24"/>
+          <w:szCs w:val="24"/>
+        </w:rPr>
+        <w:t xml:space="preserve"> git checkout branch_name</w:t>
+      </w:r>
+    </w:p>
+    <w:p>
+      <w:pPr>
+        <w:spacing w:after="0" w:line="240" w:lineRule="auto"/>
+        <w:rPr>
+          <w:rFonts w:cstheme="minorHAnsi"/>
+          <w:sz w:val="24"/>
+          <w:szCs w:val="24"/>
+        </w:rPr>
+      </w:pPr>
+      <w:r>
+        <w:rPr>
+          <w:rFonts w:cstheme="minorHAnsi"/>
+          <w:b/>
+          <w:bCs/>
+          <w:sz w:val="24"/>
+          <w:szCs w:val="24"/>
+        </w:rPr>
+        <w:t>Rename Branch:</w:t>
+      </w:r>
+      <w:r>
+        <w:rPr>
+          <w:rFonts w:cstheme="minorHAnsi"/>
+          <w:sz w:val="24"/>
+          <w:szCs w:val="24"/>
+        </w:rPr>
+        <w:t xml:space="preserve"> git branch -M branch_name</w:t>
+      </w:r>
+    </w:p>
+    <w:p>
+      <w:pPr>
+        <w:spacing w:after="0" w:line="240" w:lineRule="auto"/>
+        <w:rPr>
+          <w:rFonts w:cstheme="minorHAnsi"/>
+          <w:sz w:val="24"/>
+          <w:szCs w:val="24"/>
+        </w:rPr>
+      </w:pPr>
+    </w:p>
+    <w:p>
+      <w:pPr>
+        <w:spacing w:after="0" w:line="240" w:lineRule="auto"/>
+        <w:rPr>
+          <w:rFonts w:cstheme="minorHAnsi"/>
+          <w:sz w:val="24"/>
+          <w:szCs w:val="24"/>
+        </w:rPr>
+      </w:pPr>
+    </w:p>
+    <w:p/>
     <w:sectPr>
       <w:pgSz w:w="12240" w:h="15840"/>
       <w:pgMar w:top="1440" w:right="1440" w:bottom="1440" w:left="1440" w:header="720" w:footer="720" w:gutter="0"/>

</xml_diff>